<commit_message>
Change 8: Shared Giving Catalog: separate registration deadline of November 30, 2026 added; December 11, 2026 profile deadline unchanged.
Independent test branch created directly from BASELINE v1-original
(a5b0342). Contains this change only.

Co-Authored-By: Claude Opus 5.5 <noreply@anthropic.com>
Claude-Session: https://claude.ai/code/session_01CQxLpwe1Pu1FJJBAM5jt5M
</commit_message>
<xml_diff>
--- a/documents-src/guidelines/cpcf-shared-giving-catalog-2027-guidelines.docx
+++ b/documents-src/guidelines/cpcf-shared-giving-catalog-2027-guidelines.docx
@@ -31,7 +31,7 @@
           <w:color w:val="5F6B6E"/>
           <w:sz w:val="22"/>
         </w:rPr>
-        <w:t>Donor-advised giving catalog (abbreviated application)  ·  Profiles due December 11, 2026</w:t>
+        <w:t>Donor-advised giving catalog (abbreviated application)  ·  Registration due November 30, 2026; profiles due December 11, 2026</w:t>
       </w:r>
     </w:p>
     <w:tbl>
@@ -377,7 +377,45 @@
                 <w:b/>
                 <w:sz w:val="19"/>
               </w:rPr>
-              <w:t>Application deadline</w:t>
+              <w:t>Registration deadline</w:t>
+            </w:r>
+          </w:p>
+        </w:tc>
+        <w:tc>
+          <w:tcPr>
+            <w:tcW w:type="dxa" w:w="6192"/>
+          </w:tcPr>
+          <w:p>
+            <w:pPr>
+              <w:spacing w:after="40"/>
+            </w:pPr>
+            <w:r/>
+            <w:r>
+              <w:rPr>
+                <w:sz w:val="19"/>
+              </w:rPr>
+              <w:t>Monday, November 30, 2026, 5:00 p.m. MST</w:t>
+            </w:r>
+          </w:p>
+        </w:tc>
+      </w:tr>
+      <w:tr>
+        <w:tc>
+          <w:tcPr>
+            <w:tcW w:type="dxa" w:w="3456"/>
+            <w:shd w:val="clear" w:color="auto" w:fill="F4EEE4"/>
+          </w:tcPr>
+          <w:p>
+            <w:pPr>
+              <w:spacing w:after="40"/>
+            </w:pPr>
+            <w:r/>
+            <w:r>
+              <w:rPr>
+                <w:b/>
+                <w:sz w:val="19"/>
+              </w:rPr>
+              <w:t>Profile submission deadline</w:t>
             </w:r>
           </w:p>
         </w:tc>
@@ -468,7 +506,22 @@
         <w:rPr>
           <w:b/>
         </w:rPr>
-        <w:t xml:space="preserve">1.  Download the profile form. </w:t>
+        <w:t xml:space="preserve">1.  Register for the catalog. </w:t>
+      </w:r>
+      <w:r>
+        <w:t>Register your organization for the 2027 Shared Giving Catalog in the CPCF Grant Portal by 5:00 p.m. MST on November 30, 2026. Registration is a separate milestone from the profile submission deadline of December 11, 2026.</w:t>
+      </w:r>
+    </w:p>
+    <w:p>
+      <w:pPr>
+        <w:spacing w:after="80"/>
+        <w:ind w:left="432" w:hanging="360"/>
+      </w:pPr>
+      <w:r>
+        <w:rPr>
+          <w:b/>
+        </w:rPr>
+        <w:t xml:space="preserve">2.  Download the profile form. </w:t>
       </w:r>
       <w:r>
         <w:t>Complete the Shared Giving Catalog Profile Form, including a 150-word organizational summary and one funding need.</w:t>
@@ -483,7 +536,7 @@
         <w:rPr>
           <w:b/>
         </w:rPr>
-        <w:t xml:space="preserve">2.  Gather a photo. </w:t>
+        <w:t xml:space="preserve">3.  Gather a photo. </w:t>
       </w:r>
       <w:r>
         <w:t>Select one high-resolution photo of your work and confirm you have permission from anyone pictured.</w:t>
@@ -498,7 +551,7 @@
         <w:rPr>
           <w:b/>
         </w:rPr>
-        <w:t xml:space="preserve">3.  Submit. </w:t>
+        <w:t xml:space="preserve">4.  Submit. </w:t>
       </w:r>
       <w:r>
         <w:t>Upload the form and photo in the CPCF Grant Portal under "Shared Giving Catalog 2027" by 5:00 p.m. MST on December 11, 2026.</w:t>
@@ -513,7 +566,7 @@
         <w:rPr>
           <w:b/>
         </w:rPr>
-        <w:t xml:space="preserve">4.  Review and publication. </w:t>
+        <w:t xml:space="preserve">5.  Review and publication. </w:t>
       </w:r>
       <w:r>
         <w:t>Foundation staff confirm eligibility and may suggest edits. The catalog is published to fundholders on February 1, 2027.</w:t>

</xml_diff>

<commit_message>
Change 14: Shared Giving Catalog: Profile Form replaced with '2027 Revision 2' (new PDF and Word files; old files removed).
Independent test branch created directly from BASELINE v1-original
(a5b0342). Contains this change only.

Co-Authored-By: Claude Opus 5.5 <noreply@anthropic.com>
Claude-Session: https://claude.ai/code/session_01CQxLpwe1Pu1FJJBAM5jt5M
</commit_message>
<xml_diff>
--- a/documents-src/guidelines/cpcf-shared-giving-catalog-2027-guidelines.docx
+++ b/documents-src/guidelines/cpcf-shared-giving-catalog-2027-guidelines.docx
@@ -471,7 +471,7 @@
         <w:t xml:space="preserve">1.  Download the profile form. </w:t>
       </w:r>
       <w:r>
-        <w:t>Complete the Shared Giving Catalog Profile Form, including a 150-word organizational summary and one funding need.</w:t>
+        <w:t>Complete the Shared Giving Catalog Profile Form (2027 Revision 2), including a 150-word organizational summary and one funding need.</w:t>
       </w:r>
     </w:p>
     <w:p>
@@ -565,10 +565,10 @@
         <w:rPr>
           <w:b/>
         </w:rPr>
-        <w:t xml:space="preserve">Shared Giving Catalog Profile Form: </w:t>
+        <w:t xml:space="preserve">Shared Giving Catalog Profile Form, 2027 Revision 2: </w:t>
       </w:r>
       <w:r>
-        <w:t>https://hufsa-stack.github.io/cinder-peaks-community-foundation/documents/templates/cpcf-shared-giving-catalog-2027-profile-form.pdf</w:t>
+        <w:t>https://hufsa-stack.github.io/cinder-peaks-community-foundation/documents/templates/cpcf-shared-giving-catalog-2027-profile-form-rev2.pdf</w:t>
       </w:r>
     </w:p>
     <w:tbl>

</xml_diff>